<commit_message>
docs: add Calendar section to the landlord guide
New section "5. Calendar" after Leases: month navigation, what the three
event colours mean, and how collected amounts show per rent due date,
plus a screenshot placeholder to fill in. Sections 5-13 renumbered to
6-14 (no in-text cross-references existed, so nothing else needed
editing).

Edited in place rather than regenerated - the guide now carries 31 real
screenshots that must survive.
</commit_message>
<xml_diff>
--- a/docs/RentaPH_Landlord_Guide.docx
+++ b/docs/RentaPH_Landlord_Guide.docx
@@ -1,5 +1,50 @@
 
-<file path=word/document.xml><?xml version="1.0" encoding="utf-8"?>
+<file path=docProps\app.xml><?xml version="1.0" encoding="utf-8"?>
+<Properties xmlns="http://schemas.openxmlformats.org/officeDocument/2006/extended-properties" xmlns:vt="http://schemas.openxmlformats.org/officeDocument/2006/docPropsVTypes">
+  <Template>Normal.dotm</Template>
+  <TotalTime>74</TotalTime>
+  <Pages>18</Pages>
+  <Words>1163</Words>
+  <Characters>6634</Characters>
+  <Application>Microsoft Office Word</Application>
+  <DocSecurity>0</DocSecurity>
+  <Lines>55</Lines>
+  <Paragraphs>15</Paragraphs>
+  <ScaleCrop>false</ScaleCrop>
+  <HeadingPairs>
+    <vt:vector size="2" baseType="variant">
+      <vt:variant>
+        <vt:lpstr>Title</vt:lpstr>
+      </vt:variant>
+      <vt:variant>
+        <vt:i4>1</vt:i4>
+      </vt:variant>
+    </vt:vector>
+  </HeadingPairs>
+  <TitlesOfParts>
+    <vt:vector size="1" baseType="lpstr">
+      <vt:lpstr/>
+    </vt:vector>
+  </TitlesOfParts>
+  <Company/>
+  <LinksUpToDate>false</LinksUpToDate>
+  <CharactersWithSpaces>7782</CharactersWithSpaces>
+  <SharedDoc>false</SharedDoc>
+  <HyperlinksChanged>false</HyperlinksChanged>
+  <AppVersion>16.0000</AppVersion>
+</Properties>
+</file>
+
+<file path=docProps\core.xml><?xml version="1.0" encoding="utf-8"?>
+<cp:coreProperties xmlns:cp="http://schemas.openxmlformats.org/package/2006/metadata/core-properties" xmlns:dc="http://purl.org/dc/elements/1.1/" xmlns:dcterms="http://purl.org/dc/terms/" xmlns:dcmitype="http://purl.org/dc/dcmitype/" xmlns:xsi="http://www.w3.org/2001/XMLSchema-instance">
+  <cp:lastModifiedBy>Tumon, Jayric</cp:lastModifiedBy>
+  <cp:revision>7</cp:revision>
+  <dcterms:created xsi:type="dcterms:W3CDTF">2026-10-21T06:55:00Z</dcterms:created>
+  <dcterms:modified xsi:type="dcterms:W3CDTF">2026-10-21T08:29:00Z</dcterms:modified>
+</cp:coreProperties>
+</file>
+
+<file path=word\document.xml><?xml version="1.0" encoding="utf-8"?>
 <w:document xmlns:wpc="http://schemas.microsoft.com/office/word/2010/wordprocessingCanvas" xmlns:cx="http://schemas.microsoft.com/office/drawing/2014/chartex" xmlns:cx1="http://schemas.microsoft.com/office/drawing/2015/9/8/chartex" xmlns:cx2="http://schemas.microsoft.com/office/drawing/2015/10/21/chartex" xmlns:cx3="http://schemas.microsoft.com/office/drawing/2016/5/9/chartex" xmlns:cx4="http://schemas.microsoft.com/office/drawing/2016/5/10/chartex" xmlns:cx5="http://schemas.microsoft.com/office/drawing/2016/5/11/chartex" xmlns:cx6="http://schemas.microsoft.com/office/drawing/2016/5/12/chartex" xmlns:cx7="http://schemas.microsoft.com/office/drawing/2016/5/13/chartex" xmlns:cx8="http://schemas.microsoft.com/office/drawing/2016/5/14/chartex" xmlns:mc="http://schemas.openxmlformats.org/markup-compatibility/2006" xmlns:aink="http://schemas.microsoft.com/office/drawing/2016/ink" xmlns:am3d="http://schemas.microsoft.com/office/drawing/2017/model3d" xmlns:o="urn:schemas-microsoft-com:office:office" xmlns:oel="http://schemas.microsoft.com/office/2019/extlst" xmlns:r="http://schemas.openxmlformats.org/officeDocument/2006/relationships" xmlns:m="http://schemas.openxmlformats.org/officeDocument/2006/math" xmlns:v="urn:schemas-microsoft-com:vml" xmlns:wp14="http://schemas.microsoft.com/office/word/2010/wordprocessingDrawing" xmlns:wp="http://schemas.openxmlformats.org/drawingml/2006/wordprocessingDrawing" xmlns:w10="urn:schemas-microsoft-com:office:word" xmlns:w="http://schemas.openxmlformats.org/wordprocessingml/2006/main" xmlns:w14="http://schemas.microsoft.com/office/word/2010/wordml" xmlns:w15="http://schemas.microsoft.com/office/word/2012/wordml" xmlns:w16cex="http://schemas.microsoft.com/office/word/2018/wordml/cex" xmlns:w16cid="http://schemas.microsoft.com/office/word/2016/wordml/cid" xmlns:w16="http://schemas.microsoft.com/office/word/2018/wordml" xmlns:w16du="http://schemas.microsoft.com/office/word/2023/wordml/word16du" xmlns:w16sdtdh="http://schemas.microsoft.com/office/word/2020/wordml/sdtdatahash" xmlns:w16sdtfl="http://schemas.microsoft.com/office/word/2024/wordml/sdtformatlock" xmlns:w16se="http://schemas.microsoft.com/office/word/2015/wordml/symex" xmlns:wpg="http://schemas.microsoft.com/office/word/2010/wordprocessingGroup" xmlns:wpi="http://schemas.microsoft.com/office/word/2010/wordprocessingInk" xmlns:wne="http://schemas.microsoft.com/office/word/2006/wordml" xmlns:wps="http://schemas.microsoft.com/office/word/2010/wordprocessingShape" mc:Ignorable="w14 w15 w16se w16cid w16 w16cex w16sdtdh w16sdtfl w16du wp14">
   <w:body>
     <w:p>
@@ -1302,7 +1347,90 @@
         <w:rPr>
           <w:rFonts w:cs="Calibri"/>
         </w:rPr>
-        <w:t>5. Rent collection</w:t>
+        <w:t>5. Calendar</w:t>
+      </w:r>
+    </w:p>
+    <w:p>
+      <w:pPr>
+        <w:rPr>
+          <w:rFonts w:cs="Calibri"/>
+        </w:rPr>
+      </w:pPr>
+      <w:r>
+        <w:rPr>
+          <w:rFonts w:cs="Calibri"/>
+        </w:rPr>
+        <w:t>The calendar gives you one view of what is coming: rent due dates for every active lease, move-ins, and lease ends. Rent due dates follow each lease's billing period, so they are the same dates the rent reminders and the statement of account use.</w:t>
+      </w:r>
+    </w:p>
+    <w:p>
+      <w:pPr>
+        <w:pStyle w:val="ListNumber"/>
+        <w:rPr>
+          <w:rFonts w:cs="Calibri"/>
+        </w:rPr>
+      </w:pPr>
+      <w:r>
+        <w:rPr>
+          <w:rFonts w:cs="Calibri"/>
+        </w:rPr>
+        <w:t>Go to "Calendar" in the sidebar. Use the arrow buttons to move between months, and "Today" to return to the current month.</w:t>
+      </w:r>
+    </w:p>
+    <w:p>
+      <w:pPr>
+        <w:pStyle w:val="ListNumber"/>
+        <w:rPr>
+          <w:rFonts w:cs="Calibri"/>
+        </w:rPr>
+      </w:pPr>
+      <w:r>
+        <w:rPr>
+          <w:rFonts w:cs="Calibri"/>
+        </w:rPr>
+        <w:t>Blue dots are rent due dates. The list under the grid shows how much has been collected for each one, so you can see at a glance who has not paid yet.</w:t>
+      </w:r>
+    </w:p>
+    <w:p>
+      <w:pPr>
+        <w:pStyle w:val="ListNumber"/>
+        <w:rPr>
+          <w:rFonts w:cs="Calibri"/>
+        </w:rPr>
+      </w:pPr>
+      <w:r>
+        <w:rPr>
+          <w:rFonts w:cs="Calibri"/>
+        </w:rPr>
+        <w:t>Green dots are move-ins and amber dots are lease ends. Click a tenant's name in the list to open their lease.</w:t>
+      </w:r>
+    </w:p>
+    <w:p>
+      <w:pPr>
+        <w:rPr>
+          <w:rFonts w:cs="Calibri"/>
+        </w:rPr>
+      </w:pPr>
+      <w:r>
+        <w:rPr>
+          <w:rFonts w:cs="Calibri"/>
+          <w:highlight w:val="yellow"/>
+        </w:rPr>
+        <w:t>[Screenshot: The Calendar page showing rent due dates, a move-in and a lease end in one month]</w:t>
+      </w:r>
+    </w:p>
+    <w:p>
+      <w:pPr>
+        <w:pStyle w:val="Heading2"/>
+        <w:rPr>
+          <w:rFonts w:cs="Calibri"/>
+        </w:rPr>
+      </w:pPr>
+      <w:r>
+        <w:rPr>
+          <w:rFonts w:cs="Calibri"/>
+        </w:rPr>
+        <w:t>6. Rent collection</w:t>
       </w:r>
     </w:p>
     <w:p>
@@ -1316,7 +1444,7 @@
         <w:rPr>
           <w:rFonts w:cs="Calibri"/>
         </w:rPr>
-        <w:t>5.1 Recording a payment</w:t>
+        <w:t>6.1 Recording a payment</w:t>
       </w:r>
     </w:p>
     <w:p>
@@ -1456,7 +1584,7 @@
         <w:rPr>
           <w:rFonts w:cs="Calibri"/>
         </w:rPr>
-        <w:t>5.2 Verifying tenant-submitted payments</w:t>
+        <w:t>6.2 Verifying tenant-submitted payments</w:t>
       </w:r>
     </w:p>
     <w:p>
@@ -1583,7 +1711,7 @@
         <w:rPr>
           <w:rFonts w:cs="Calibri"/>
         </w:rPr>
-        <w:t>5.3 Statement of account</w:t>
+        <w:t>6.3 Statement of account</w:t>
       </w:r>
     </w:p>
     <w:p>
@@ -1709,7 +1837,7 @@
         <w:rPr>
           <w:rFonts w:cs="Calibri"/>
         </w:rPr>
-        <w:t>5.4 Rent reminders</w:t>
+        <w:t>6.4 Rent reminders</w:t>
       </w:r>
     </w:p>
     <w:p>
@@ -1855,7 +1983,7 @@
         <w:rPr>
           <w:rFonts w:cs="Calibri"/>
         </w:rPr>
-        <w:t>6. Utility sub-metering</w:t>
+        <w:t>7. Utility sub-metering</w:t>
       </w:r>
     </w:p>
     <w:p>
@@ -1869,7 +1997,7 @@
         <w:rPr>
           <w:rFonts w:cs="Calibri"/>
         </w:rPr>
-        <w:t>6.1 Adding meters to a unit</w:t>
+        <w:t>7.1 Adding meters to a unit</w:t>
       </w:r>
     </w:p>
     <w:p>
@@ -1975,7 +2103,7 @@
         <w:rPr>
           <w:rFonts w:cs="Calibri"/>
         </w:rPr>
-        <w:t>6.2 Recording a meter reading</w:t>
+        <w:t>7.2 Recording a meter reading</w:t>
       </w:r>
     </w:p>
     <w:p>
@@ -2053,7 +2181,7 @@
         <w:rPr>
           <w:rFonts w:cs="Calibri"/>
         </w:rPr>
-        <w:t>6.3 Manual utility charges</w:t>
+        <w:t>7.3 Manual utility charges</w:t>
       </w:r>
     </w:p>
     <w:p>
@@ -2171,7 +2299,7 @@
         <w:rPr>
           <w:rFonts w:cs="Calibri"/>
         </w:rPr>
-        <w:t>7. Maintenance requests</w:t>
+        <w:t>8. Maintenance requests</w:t>
       </w:r>
     </w:p>
     <w:p>
@@ -2312,7 +2440,7 @@
         <w:rPr>
           <w:rFonts w:cs="Calibri"/>
         </w:rPr>
-        <w:t>8. Contracts</w:t>
+        <w:t>9. Contracts</w:t>
       </w:r>
     </w:p>
     <w:p>
@@ -2326,7 +2454,7 @@
         <w:rPr>
           <w:rFonts w:cs="Calibri"/>
         </w:rPr>
-        <w:t>8.1 Creating a contract</w:t>
+        <w:t>9.1 Creating a contract</w:t>
       </w:r>
     </w:p>
     <w:p>
@@ -2453,7 +2581,7 @@
         <w:rPr>
           <w:rFonts w:cs="Calibri"/>
         </w:rPr>
-        <w:t>8.2 Sending for signature</w:t>
+        <w:t>9.2 Sending for signature</w:t>
       </w:r>
     </w:p>
     <w:p>
@@ -2721,7 +2849,7 @@
         <w:rPr>
           <w:rFonts w:cs="Calibri"/>
         </w:rPr>
-        <w:t>8.3 Reminders</w:t>
+        <w:t>9.3 Reminders</w:t>
       </w:r>
     </w:p>
     <w:p>
@@ -2748,7 +2876,7 @@
         <w:rPr>
           <w:rFonts w:cs="Calibri"/>
         </w:rPr>
-        <w:t>9. Tenant portal</w:t>
+        <w:t>10. Tenant portal</w:t>
       </w:r>
     </w:p>
     <w:p>
@@ -2903,7 +3031,7 @@
         <w:rPr>
           <w:rFonts w:cs="Calibri"/>
         </w:rPr>
-        <w:t>10. Reports and finance</w:t>
+        <w:t>11. Reports and finance</w:t>
       </w:r>
     </w:p>
     <w:p>
@@ -2917,7 +3045,7 @@
         <w:rPr>
           <w:rFonts w:cs="Calibri"/>
         </w:rPr>
-        <w:t>10.1 Finance page</w:t>
+        <w:t>11.1 Finance page</w:t>
       </w:r>
     </w:p>
     <w:p>
@@ -3089,7 +3217,7 @@
         <w:rPr>
           <w:rFonts w:cs="Calibri"/>
         </w:rPr>
-        <w:t>10.2 Reports</w:t>
+        <w:t>11.2 Reports</w:t>
       </w:r>
     </w:p>
     <w:p>
@@ -3259,7 +3387,7 @@
         <w:rPr>
           <w:rFonts w:cs="Calibri"/>
         </w:rPr>
-        <w:t>11. Referrals</w:t>
+        <w:t>12. Referrals</w:t>
       </w:r>
     </w:p>
     <w:p>
@@ -3385,7 +3513,7 @@
         <w:rPr>
           <w:rFonts w:cs="Calibri"/>
         </w:rPr>
-        <w:t>12. Settings</w:t>
+        <w:t>13. Settings</w:t>
       </w:r>
     </w:p>
     <w:p>
@@ -3597,7 +3725,7 @@
         <w:rPr>
           <w:rFonts w:cs="Calibri"/>
         </w:rPr>
-        <w:t>13. Troubleshooting</w:t>
+        <w:t>14. Troubleshooting</w:t>
       </w:r>
     </w:p>
     <w:p>
@@ -3718,7 +3846,99 @@
 </w:document>
 </file>
 
-<file path=word/styles.xml><?xml version="1.0" encoding="utf-8"?>
+<file path=word\fontTable.xml><?xml version="1.0" encoding="utf-8"?>
+<w:fonts xmlns:mc="http://schemas.openxmlformats.org/markup-compatibility/2006" xmlns:r="http://schemas.openxmlformats.org/officeDocument/2006/relationships" xmlns:w="http://schemas.openxmlformats.org/wordprocessingml/2006/main" xmlns:w14="http://schemas.microsoft.com/office/word/2010/wordml" xmlns:w15="http://schemas.microsoft.com/office/word/2012/wordml" xmlns:w16cex="http://schemas.microsoft.com/office/word/2018/wordml/cex" xmlns:w16cid="http://schemas.microsoft.com/office/word/2016/wordml/cid" xmlns:w16="http://schemas.microsoft.com/office/word/2018/wordml" xmlns:w16du="http://schemas.microsoft.com/office/word/2023/wordml/word16du" xmlns:w16sdtdh="http://schemas.microsoft.com/office/word/2020/wordml/sdtdatahash" xmlns:w16sdtfl="http://schemas.microsoft.com/office/word/2024/wordml/sdtformatlock" xmlns:w16se="http://schemas.microsoft.com/office/word/2015/wordml/symex" mc:Ignorable="w14 w15 w16se w16cid w16 w16cex w16sdtdh w16sdtfl w16du">
+  <w:font w:name="Aptos">
+    <w:charset w:val="00"/>
+    <w:family w:val="swiss"/>
+    <w:pitch w:val="variable"/>
+    <w:sig w:usb0="20000287" w:usb1="00000003" w:usb2="00000000" w:usb3="00000000" w:csb0="0000019F" w:csb1="00000000"/>
+  </w:font>
+  <w:font w:name="Times New Roman">
+    <w:panose1 w:val="02020603050405020304"/>
+    <w:charset w:val="00"/>
+    <w:family w:val="roman"/>
+    <w:pitch w:val="variable"/>
+    <w:sig w:usb0="E0002EFF" w:usb1="C000785B" w:usb2="00000009" w:usb3="00000000" w:csb0="000001FF" w:csb1="00000000"/>
+  </w:font>
+  <w:font w:name="Calibri">
+    <w:panose1 w:val="020F0502020204030204"/>
+    <w:charset w:val="00"/>
+    <w:family w:val="swiss"/>
+    <w:pitch w:val="variable"/>
+    <w:sig w:usb0="E4002EFF" w:usb1="C200247B" w:usb2="00000009" w:usb3="00000000" w:csb0="000001FF" w:csb1="00000000"/>
+  </w:font>
+  <w:font w:name="Symbol">
+    <w:panose1 w:val="05050102010706020507"/>
+    <w:charset w:val="02"/>
+    <w:family w:val="roman"/>
+    <w:pitch w:val="variable"/>
+    <w:sig w:usb0="00000000" w:usb1="10000000" w:usb2="00000000" w:usb3="00000000" w:csb0="80000000" w:csb1="00000000"/>
+  </w:font>
+  <w:font w:name="Aptos Display">
+    <w:charset w:val="00"/>
+    <w:family w:val="swiss"/>
+    <w:pitch w:val="variable"/>
+    <w:sig w:usb0="20000287" w:usb1="00000003" w:usb2="00000000" w:usb3="00000000" w:csb0="0000019F" w:csb1="00000000"/>
+  </w:font>
+</w:fonts>
+</file>
+
+<file path=word\settings.xml><?xml version="1.0" encoding="utf-8"?>
+<w:settings xmlns:mc="http://schemas.openxmlformats.org/markup-compatibility/2006" xmlns:o="urn:schemas-microsoft-com:office:office" xmlns:r="http://schemas.openxmlformats.org/officeDocument/2006/relationships" xmlns:m="http://schemas.openxmlformats.org/officeDocument/2006/math" xmlns:v="urn:schemas-microsoft-com:vml" xmlns:w10="urn:schemas-microsoft-com:office:word" xmlns:w="http://schemas.openxmlformats.org/wordprocessingml/2006/main" xmlns:w14="http://schemas.microsoft.com/office/word/2010/wordml" xmlns:w15="http://schemas.microsoft.com/office/word/2012/wordml" xmlns:w16cex="http://schemas.microsoft.com/office/word/2018/wordml/cex" xmlns:w16cid="http://schemas.microsoft.com/office/word/2016/wordml/cid" xmlns:w16="http://schemas.microsoft.com/office/word/2018/wordml" xmlns:w16du="http://schemas.microsoft.com/office/word/2023/wordml/word16du" xmlns:w16sdtdh="http://schemas.microsoft.com/office/word/2020/wordml/sdtdatahash" xmlns:w16sdtfl="http://schemas.microsoft.com/office/word/2024/wordml/sdtformatlock" xmlns:w16se="http://schemas.microsoft.com/office/word/2015/wordml/symex" xmlns:sl="http://schemas.openxmlformats.org/schemaLibrary/2006/main" mc:Ignorable="w14 w15 w16se w16cid w16 w16cex w16sdtdh w16sdtfl w16du">
+  <w:zoom w:percent="100"/>
+  <w:defaultTabStop w:val="720"/>
+  <w:characterSpacingControl w:val="doNotCompress"/>
+  <w:compat>
+    <w:useFELayout/>
+    <w:compatSetting w:name="compatibilityMode" w:uri="http://schemas.microsoft.com/office/word" w:val="12"/>
+    <w:compatSetting w:name="useWord2013TrackBottomHyphenation" w:uri="http://schemas.microsoft.com/office/word" w:val="1"/>
+  </w:compat>
+  <w:rsids>
+    <w:rsidRoot w:val="00F50322"/>
+    <w:rsid w:val="001D3F66"/>
+    <w:rsid w:val="002D0EF3"/>
+    <w:rsid w:val="0036094D"/>
+    <w:rsid w:val="00517F1E"/>
+    <w:rsid w:val="00592AD3"/>
+    <w:rsid w:val="005E4E7E"/>
+    <w:rsid w:val="00645B40"/>
+    <w:rsid w:val="00774CCB"/>
+    <w:rsid w:val="007D36DA"/>
+    <w:rsid w:val="008F1942"/>
+    <w:rsid w:val="00C16601"/>
+    <w:rsid w:val="00C30B6F"/>
+    <w:rsid w:val="00F50322"/>
+  </w:rsids>
+  <m:mathPr>
+    <m:mathFont m:val="Cambria Math"/>
+    <m:brkBin m:val="before"/>
+    <m:brkBinSub m:val="--"/>
+    <m:smallFrac m:val="0"/>
+    <m:dispDef/>
+    <m:lMargin m:val="0"/>
+    <m:rMargin m:val="0"/>
+    <m:defJc m:val="centerGroup"/>
+    <m:wrapIndent m:val="1440"/>
+    <m:intLim m:val="subSup"/>
+    <m:naryLim m:val="undOvr"/>
+  </m:mathPr>
+  <w:themeFontLang w:val="en-PH"/>
+  <w:clrSchemeMapping w:bg1="light1" w:t1="dark1" w:bg2="light2" w:t2="dark2" w:accent1="accent1" w:accent2="accent2" w:accent3="accent3" w:accent4="accent4" w:accent5="accent5" w:accent6="accent6" w:hyperlink="hyperlink" w:followedHyperlink="followedHyperlink"/>
+  <w:shapeDefaults>
+    <o:shapedefaults v:ext="edit" spidmax="1026"/>
+    <o:shapelayout v:ext="edit">
+      <o:idmap v:ext="edit" data="1"/>
+    </o:shapelayout>
+  </w:shapeDefaults>
+  <w:decimalSymbol w:val="."/>
+  <w:listSeparator w:val=","/>
+  <w14:docId w14:val="3FA57A5D"/>
+  <w15:docId w15:val="{F2A328E8-6840-40FF-A18F-A14D91D5A134}"/>
+</w:settings>
+</file>
+
+<file path=word\styles.xml><?xml version="1.0" encoding="utf-8"?>
 <w:styles xmlns:mc="http://schemas.openxmlformats.org/markup-compatibility/2006" xmlns:r="http://schemas.openxmlformats.org/officeDocument/2006/relationships" xmlns:w="http://schemas.openxmlformats.org/wordprocessingml/2006/main" xmlns:w14="http://schemas.microsoft.com/office/word/2010/wordml" xmlns:w15="http://schemas.microsoft.com/office/word/2012/wordml" xmlns:w16cex="http://schemas.microsoft.com/office/word/2018/wordml/cex" xmlns:w16cid="http://schemas.microsoft.com/office/word/2016/wordml/cid" xmlns:w16="http://schemas.microsoft.com/office/word/2018/wordml" xmlns:w16du="http://schemas.microsoft.com/office/word/2023/wordml/word16du" xmlns:w16sdtdh="http://schemas.microsoft.com/office/word/2020/wordml/sdtdatahash" xmlns:w16sdtfl="http://schemas.microsoft.com/office/word/2024/wordml/sdtformatlock" xmlns:w16se="http://schemas.microsoft.com/office/word/2015/wordml/symex" mc:Ignorable="w14 w15 w16se w16cid w16 w16cex w16sdtdh w16sdtfl w16du">
   <w:docDefaults>
     <w:rPrDefault>
@@ -4213,7 +4433,7 @@
 </w:styles>
 </file>
 
-<file path=word/theme/theme1.xml><?xml version="1.0" encoding="utf-8"?>
+<file path=word\theme\theme1.xml><?xml version="1.0" encoding="utf-8"?>
 <a:theme xmlns:a="http://schemas.openxmlformats.org/drawingml/2006/main" name="Office Theme">
   <a:themeElements>
     <a:clrScheme name="Office">
@@ -4526,4 +4746,8 @@
     </a:ext>
   </a:extLst>
 </a:theme>
+</file>
+
+<file path=word\webSettings.xml><?xml version="1.0" encoding="utf-8"?>
+<w:webSettings xmlns:mc="http://schemas.openxmlformats.org/markup-compatibility/2006" xmlns:r="http://schemas.openxmlformats.org/officeDocument/2006/relationships" xmlns:w="http://schemas.openxmlformats.org/wordprocessingml/2006/main" xmlns:w14="http://schemas.microsoft.com/office/word/2010/wordml" xmlns:w15="http://schemas.microsoft.com/office/word/2012/wordml" xmlns:w16cex="http://schemas.microsoft.com/office/word/2018/wordml/cex" xmlns:w16cid="http://schemas.microsoft.com/office/word/2016/wordml/cid" xmlns:w16="http://schemas.microsoft.com/office/word/2018/wordml" xmlns:w16du="http://schemas.microsoft.com/office/word/2023/wordml/word16du" xmlns:w16sdtdh="http://schemas.microsoft.com/office/word/2020/wordml/sdtdatahash" xmlns:w16sdtfl="http://schemas.microsoft.com/office/word/2024/wordml/sdtformatlock" xmlns:w16se="http://schemas.microsoft.com/office/word/2015/wordml/symex" mc:Ignorable="w14 w15 w16se w16cid w16 w16cex w16sdtdh w16sdtfl w16du"/>
 </file>
</xml_diff>